<commit_message>
TechCon abstract: add Table 2 (previous lab results across x86/DGX runs) + fail-safe guard note in Evidence section
</commit_message>
<xml_diff>
--- a/docs/hpe/techcon2027-self-securing-5g.docx
+++ b/docs/hpe/techcon2027-self-securing-5g.docx
@@ -935,7 +935,7 @@
           <w:sz w:val="24"/>
           <w:szCs w:val="24"/>
         </w:rPr>
-        <w:t xml:space="preserve">, a curated corpus of N3/N4 attacks, the ML detector, and SRX (cSRX) enforcement, on a single GPU host. Trained only on benign traffic, the detector separates benign from attack at </w:t>
+        <w:t xml:space="preserve">, a curated corpus of N3/N4 attacks, the ML detector, and SRX (cSRX) enforcement. Trained only on benign traffic, the detector was evaluated on real captured traffic across three runs as the testbed matured from x86 to GPU (Table 2). </w:t>
       </w:r>
       <w:r>
         <w:rPr>
@@ -946,16 +946,841 @@
           <w:sz w:val="24"/>
           <w:szCs w:val="24"/>
         </w:rPr>
-        <w:t xml:space="preserve">ROC-AUC 1.000 (GPU autoencoder) and 0.989 (Isolation Forest), with 100% recall across four attack classes</w:t>
-      </w:r>
-      <w:r>
-        <w:rPr>
-          <w:rFonts w:ascii="Times New Roman" w:cs="Times New Roman" w:eastAsia="Times New Roman" w:hAnsi="Times New Roman"/>
-          <w:color w:val="111111"/>
-          <w:sz w:val="24"/>
-          <w:szCs w:val="24"/>
-        </w:rPr>
-        <w:t xml:space="preserve"> and roughly 5% benign false-alarm; SRX screens rate-limit volumetric floods. This substantiates the two hardest stages of the loop — detection and enforcement — on real captured traffic.</w:t>
+        <w:t xml:space="preserve">Every run flagged 100% of attack windows across all four classes</w:t>
+      </w:r>
+      <w:r>
+        <w:rPr>
+          <w:rFonts w:ascii="Times New Roman" w:cs="Times New Roman" w:eastAsia="Times New Roman" w:hAnsi="Times New Roman"/>
+          <w:color w:val="111111"/>
+          <w:sz w:val="24"/>
+          <w:szCs w:val="24"/>
+        </w:rPr>
+        <w:t xml:space="preserve">; the GPU-trained autoencoder reached perfect benign/attack separation (ROC-AUC 1.000) at ~5% benign false-alarm. SRX screens rate-limit the volumetric floods.</w:t>
+      </w:r>
+    </w:p>
+    <w:tbl>
+      <w:tblPr>
+        <w:tblW w:type="dxa" w:w="10080"/>
+        <w:tblBorders>
+          <w:top w:val="single" w:color="C9D6E8" w:sz="3"/>
+          <w:left w:val="single" w:color="C9D6E8" w:sz="3"/>
+          <w:bottom w:val="single" w:color="C9D6E8" w:sz="3"/>
+          <w:right w:val="single" w:color="C9D6E8" w:sz="3"/>
+          <w:insideH w:val="single" w:color="C9D6E8" w:sz="3"/>
+          <w:insideV w:val="single" w:color="C9D6E8" w:sz="3"/>
+        </w:tblBorders>
+      </w:tblPr>
+      <w:tblGrid>
+        <w:gridCol w:w="2380"/>
+        <w:gridCol w:w="1540"/>
+        <w:gridCol w:w="1180"/>
+        <w:gridCol w:w="1080"/>
+        <w:gridCol w:w="1120"/>
+        <w:gridCol w:w="1080"/>
+        <w:gridCol w:w="1700"/>
+      </w:tblGrid>
+      <w:tr>
+        <w:tc>
+          <w:tcPr>
+            <w:tcW w:type="dxa" w:w="2380"/>
+            <w:shd w:fill="0E1B33" w:color="auto" w:val="clear"/>
+            <w:tcMar>
+              <w:top w:type="dxa" w:w="36"/>
+              <w:left w:type="dxa" w:w="70"/>
+              <w:bottom w:type="dxa" w:w="36"/>
+              <w:right w:type="dxa" w:w="70"/>
+            </w:tcMar>
+          </w:tcPr>
+          <w:p>
+            <w:pPr>
+              <w:jc w:val="left"/>
+            </w:pPr>
+            <w:r>
+              <w:rPr>
+                <w:rFonts w:ascii="Times New Roman" w:cs="Times New Roman" w:eastAsia="Times New Roman" w:hAnsi="Times New Roman"/>
+                <w:b/>
+                <w:bCs/>
+                <w:color w:val="FFFFFF"/>
+                <w:sz w:val="18"/>
+                <w:szCs w:val="18"/>
+              </w:rPr>
+              <w:t xml:space="preserve">Run (environment · model)</w:t>
+            </w:r>
+          </w:p>
+        </w:tc>
+        <w:tc>
+          <w:tcPr>
+            <w:tcW w:type="dxa" w:w="1540"/>
+            <w:shd w:fill="0E1B33" w:color="auto" w:val="clear"/>
+            <w:tcMar>
+              <w:top w:type="dxa" w:w="36"/>
+              <w:left w:type="dxa" w:w="70"/>
+              <w:bottom w:type="dxa" w:w="36"/>
+              <w:right w:type="dxa" w:w="70"/>
+            </w:tcMar>
+          </w:tcPr>
+          <w:p>
+            <w:pPr>
+              <w:jc w:val="center"/>
+            </w:pPr>
+            <w:r>
+              <w:rPr>
+                <w:rFonts w:ascii="Times New Roman" w:cs="Times New Roman" w:eastAsia="Times New Roman" w:hAnsi="Times New Roman"/>
+                <w:b/>
+                <w:bCs/>
+                <w:color w:val="FFFFFF"/>
+                <w:sz w:val="18"/>
+                <w:szCs w:val="18"/>
+              </w:rPr>
+              <w:t xml:space="preserve">Windows (train)</w:t>
+            </w:r>
+          </w:p>
+        </w:tc>
+        <w:tc>
+          <w:tcPr>
+            <w:tcW w:type="dxa" w:w="1180"/>
+            <w:shd w:fill="0E1B33" w:color="auto" w:val="clear"/>
+            <w:tcMar>
+              <w:top w:type="dxa" w:w="36"/>
+              <w:left w:type="dxa" w:w="70"/>
+              <w:bottom w:type="dxa" w:w="36"/>
+              <w:right w:type="dxa" w:w="70"/>
+            </w:tcMar>
+          </w:tcPr>
+          <w:p>
+            <w:pPr>
+              <w:jc w:val="center"/>
+            </w:pPr>
+            <w:r>
+              <w:rPr>
+                <w:rFonts w:ascii="Times New Roman" w:cs="Times New Roman" w:eastAsia="Times New Roman" w:hAnsi="Times New Roman"/>
+                <w:b/>
+                <w:bCs/>
+                <w:color w:val="FFFFFF"/>
+                <w:sz w:val="18"/>
+                <w:szCs w:val="18"/>
+              </w:rPr>
+              <w:t xml:space="preserve">ROC-AUC</w:t>
+            </w:r>
+          </w:p>
+        </w:tc>
+        <w:tc>
+          <w:tcPr>
+            <w:tcW w:type="dxa" w:w="1080"/>
+            <w:shd w:fill="0E1B33" w:color="auto" w:val="clear"/>
+            <w:tcMar>
+              <w:top w:type="dxa" w:w="36"/>
+              <w:left w:type="dxa" w:w="70"/>
+              <w:bottom w:type="dxa" w:w="36"/>
+              <w:right w:type="dxa" w:w="70"/>
+            </w:tcMar>
+          </w:tcPr>
+          <w:p>
+            <w:pPr>
+              <w:jc w:val="center"/>
+            </w:pPr>
+            <w:r>
+              <w:rPr>
+                <w:rFonts w:ascii="Times New Roman" w:cs="Times New Roman" w:eastAsia="Times New Roman" w:hAnsi="Times New Roman"/>
+                <w:b/>
+                <w:bCs/>
+                <w:color w:val="FFFFFF"/>
+                <w:sz w:val="18"/>
+                <w:szCs w:val="18"/>
+              </w:rPr>
+              <w:t xml:space="preserve">Recall</w:t>
+            </w:r>
+          </w:p>
+        </w:tc>
+        <w:tc>
+          <w:tcPr>
+            <w:tcW w:type="dxa" w:w="1120"/>
+            <w:shd w:fill="0E1B33" w:color="auto" w:val="clear"/>
+            <w:tcMar>
+              <w:top w:type="dxa" w:w="36"/>
+              <w:left w:type="dxa" w:w="70"/>
+              <w:bottom w:type="dxa" w:w="36"/>
+              <w:right w:type="dxa" w:w="70"/>
+            </w:tcMar>
+          </w:tcPr>
+          <w:p>
+            <w:pPr>
+              <w:jc w:val="center"/>
+            </w:pPr>
+            <w:r>
+              <w:rPr>
+                <w:rFonts w:ascii="Times New Roman" w:cs="Times New Roman" w:eastAsia="Times New Roman" w:hAnsi="Times New Roman"/>
+                <w:b/>
+                <w:bCs/>
+                <w:color w:val="FFFFFF"/>
+                <w:sz w:val="18"/>
+                <w:szCs w:val="18"/>
+              </w:rPr>
+              <w:t xml:space="preserve">Prec.</w:t>
+            </w:r>
+          </w:p>
+        </w:tc>
+        <w:tc>
+          <w:tcPr>
+            <w:tcW w:type="dxa" w:w="1080"/>
+            <w:shd w:fill="0E1B33" w:color="auto" w:val="clear"/>
+            <w:tcMar>
+              <w:top w:type="dxa" w:w="36"/>
+              <w:left w:type="dxa" w:w="70"/>
+              <w:bottom w:type="dxa" w:w="36"/>
+              <w:right w:type="dxa" w:w="70"/>
+            </w:tcMar>
+          </w:tcPr>
+          <w:p>
+            <w:pPr>
+              <w:jc w:val="center"/>
+            </w:pPr>
+            <w:r>
+              <w:rPr>
+                <w:rFonts w:ascii="Times New Roman" w:cs="Times New Roman" w:eastAsia="Times New Roman" w:hAnsi="Times New Roman"/>
+                <w:b/>
+                <w:bCs/>
+                <w:color w:val="FFFFFF"/>
+                <w:sz w:val="18"/>
+                <w:szCs w:val="18"/>
+              </w:rPr>
+              <w:t xml:space="preserve">F1</w:t>
+            </w:r>
+          </w:p>
+        </w:tc>
+        <w:tc>
+          <w:tcPr>
+            <w:tcW w:type="dxa" w:w="1700"/>
+            <w:shd w:fill="0E1B33" w:color="auto" w:val="clear"/>
+            <w:tcMar>
+              <w:top w:type="dxa" w:w="36"/>
+              <w:left w:type="dxa" w:w="70"/>
+              <w:bottom w:type="dxa" w:w="36"/>
+              <w:right w:type="dxa" w:w="70"/>
+            </w:tcMar>
+          </w:tcPr>
+          <w:p>
+            <w:pPr>
+              <w:jc w:val="center"/>
+            </w:pPr>
+            <w:r>
+              <w:rPr>
+                <w:rFonts w:ascii="Times New Roman" w:cs="Times New Roman" w:eastAsia="Times New Roman" w:hAnsi="Times New Roman"/>
+                <w:b/>
+                <w:bCs/>
+                <w:color w:val="FFFFFF"/>
+                <w:sz w:val="18"/>
+                <w:szCs w:val="18"/>
+              </w:rPr>
+              <w:t xml:space="preserve">Benign FA</w:t>
+            </w:r>
+          </w:p>
+        </w:tc>
+      </w:tr>
+      <w:tr>
+        <w:tc>
+          <w:tcPr>
+            <w:tcW w:type="dxa" w:w="2380"/>
+            <w:tcMar>
+              <w:top w:type="dxa" w:w="36"/>
+              <w:left w:type="dxa" w:w="70"/>
+              <w:bottom w:type="dxa" w:w="36"/>
+              <w:right w:type="dxa" w:w="70"/>
+            </w:tcMar>
+          </w:tcPr>
+          <w:p>
+            <w:pPr>
+              <w:jc w:val="left"/>
+            </w:pPr>
+            <w:r>
+              <w:rPr>
+                <w:rFonts w:ascii="Times New Roman" w:cs="Times New Roman" w:eastAsia="Times New Roman" w:hAnsi="Times New Roman"/>
+                <w:b/>
+                <w:bCs/>
+                <w:color w:val="111111"/>
+                <w:sz w:val="18"/>
+                <w:szCs w:val="18"/>
+              </w:rPr>
+              <w:t xml:space="preserve">x86 · Isolation Forest (CPU)</w:t>
+            </w:r>
+          </w:p>
+        </w:tc>
+        <w:tc>
+          <w:tcPr>
+            <w:tcW w:type="dxa" w:w="1540"/>
+            <w:tcMar>
+              <w:top w:type="dxa" w:w="36"/>
+              <w:left w:type="dxa" w:w="70"/>
+              <w:bottom w:type="dxa" w:w="36"/>
+              <w:right w:type="dxa" w:w="70"/>
+            </w:tcMar>
+          </w:tcPr>
+          <w:p>
+            <w:pPr>
+              <w:jc w:val="center"/>
+            </w:pPr>
+            <w:r>
+              <w:rPr>
+                <w:rFonts w:ascii="Times New Roman" w:cs="Times New Roman" w:eastAsia="Times New Roman" w:hAnsi="Times New Roman"/>
+                <w:b w:val="false"/>
+                <w:bCs w:val="false"/>
+                <w:color w:val="111111"/>
+                <w:sz w:val="18"/>
+                <w:szCs w:val="18"/>
+              </w:rPr>
+              <w:t xml:space="preserve">270 (68)</w:t>
+            </w:r>
+          </w:p>
+        </w:tc>
+        <w:tc>
+          <w:tcPr>
+            <w:tcW w:type="dxa" w:w="1180"/>
+            <w:tcMar>
+              <w:top w:type="dxa" w:w="36"/>
+              <w:left w:type="dxa" w:w="70"/>
+              <w:bottom w:type="dxa" w:w="36"/>
+              <w:right w:type="dxa" w:w="70"/>
+            </w:tcMar>
+          </w:tcPr>
+          <w:p>
+            <w:pPr>
+              <w:jc w:val="center"/>
+            </w:pPr>
+            <w:r>
+              <w:rPr>
+                <w:rFonts w:ascii="Times New Roman" w:cs="Times New Roman" w:eastAsia="Times New Roman" w:hAnsi="Times New Roman"/>
+                <w:b w:val="false"/>
+                <w:bCs w:val="false"/>
+                <w:color w:val="111111"/>
+                <w:sz w:val="18"/>
+                <w:szCs w:val="18"/>
+              </w:rPr>
+              <w:t xml:space="preserve">0.958</w:t>
+            </w:r>
+          </w:p>
+        </w:tc>
+        <w:tc>
+          <w:tcPr>
+            <w:tcW w:type="dxa" w:w="1080"/>
+            <w:tcMar>
+              <w:top w:type="dxa" w:w="36"/>
+              <w:left w:type="dxa" w:w="70"/>
+              <w:bottom w:type="dxa" w:w="36"/>
+              <w:right w:type="dxa" w:w="70"/>
+            </w:tcMar>
+          </w:tcPr>
+          <w:p>
+            <w:pPr>
+              <w:jc w:val="center"/>
+            </w:pPr>
+            <w:r>
+              <w:rPr>
+                <w:rFonts w:ascii="Times New Roman" w:cs="Times New Roman" w:eastAsia="Times New Roman" w:hAnsi="Times New Roman"/>
+                <w:b w:val="false"/>
+                <w:bCs w:val="false"/>
+                <w:color w:val="111111"/>
+                <w:sz w:val="18"/>
+                <w:szCs w:val="18"/>
+              </w:rPr>
+              <w:t xml:space="preserve">1.000</w:t>
+            </w:r>
+          </w:p>
+        </w:tc>
+        <w:tc>
+          <w:tcPr>
+            <w:tcW w:type="dxa" w:w="1120"/>
+            <w:tcMar>
+              <w:top w:type="dxa" w:w="36"/>
+              <w:left w:type="dxa" w:w="70"/>
+              <w:bottom w:type="dxa" w:w="36"/>
+              <w:right w:type="dxa" w:w="70"/>
+            </w:tcMar>
+          </w:tcPr>
+          <w:p>
+            <w:pPr>
+              <w:jc w:val="center"/>
+            </w:pPr>
+            <w:r>
+              <w:rPr>
+                <w:rFonts w:ascii="Times New Roman" w:cs="Times New Roman" w:eastAsia="Times New Roman" w:hAnsi="Times New Roman"/>
+                <w:b w:val="false"/>
+                <w:bCs w:val="false"/>
+                <w:color w:val="111111"/>
+                <w:sz w:val="18"/>
+                <w:szCs w:val="18"/>
+              </w:rPr>
+              <w:t xml:space="preserve">0.981</w:t>
+            </w:r>
+          </w:p>
+        </w:tc>
+        <w:tc>
+          <w:tcPr>
+            <w:tcW w:type="dxa" w:w="1080"/>
+            <w:tcMar>
+              <w:top w:type="dxa" w:w="36"/>
+              <w:left w:type="dxa" w:w="70"/>
+              <w:bottom w:type="dxa" w:w="36"/>
+              <w:right w:type="dxa" w:w="70"/>
+            </w:tcMar>
+          </w:tcPr>
+          <w:p>
+            <w:pPr>
+              <w:jc w:val="center"/>
+            </w:pPr>
+            <w:r>
+              <w:rPr>
+                <w:rFonts w:ascii="Times New Roman" w:cs="Times New Roman" w:eastAsia="Times New Roman" w:hAnsi="Times New Roman"/>
+                <w:b w:val="false"/>
+                <w:bCs w:val="false"/>
+                <w:color w:val="111111"/>
+                <w:sz w:val="18"/>
+                <w:szCs w:val="18"/>
+              </w:rPr>
+              <w:t xml:space="preserve">0.990</w:t>
+            </w:r>
+          </w:p>
+        </w:tc>
+        <w:tc>
+          <w:tcPr>
+            <w:tcW w:type="dxa" w:w="1700"/>
+            <w:tcMar>
+              <w:top w:type="dxa" w:w="36"/>
+              <w:left w:type="dxa" w:w="70"/>
+              <w:bottom w:type="dxa" w:w="36"/>
+              <w:right w:type="dxa" w:w="70"/>
+            </w:tcMar>
+          </w:tcPr>
+          <w:p>
+            <w:pPr>
+              <w:jc w:val="center"/>
+            </w:pPr>
+            <w:r>
+              <w:rPr>
+                <w:rFonts w:ascii="Times New Roman" w:cs="Times New Roman" w:eastAsia="Times New Roman" w:hAnsi="Times New Roman"/>
+                <w:b w:val="false"/>
+                <w:bCs w:val="false"/>
+                <w:color w:val="111111"/>
+                <w:sz w:val="18"/>
+                <w:szCs w:val="18"/>
+              </w:rPr>
+              <w:t xml:space="preserve">6.5%</w:t>
+            </w:r>
+          </w:p>
+        </w:tc>
+      </w:tr>
+      <w:tr>
+        <w:tc>
+          <w:tcPr>
+            <w:tcW w:type="dxa" w:w="2380"/>
+            <w:tcMar>
+              <w:top w:type="dxa" w:w="36"/>
+              <w:left w:type="dxa" w:w="70"/>
+              <w:bottom w:type="dxa" w:w="36"/>
+              <w:right w:type="dxa" w:w="70"/>
+            </w:tcMar>
+          </w:tcPr>
+          <w:p>
+            <w:pPr>
+              <w:jc w:val="left"/>
+            </w:pPr>
+            <w:r>
+              <w:rPr>
+                <w:rFonts w:ascii="Times New Roman" w:cs="Times New Roman" w:eastAsia="Times New Roman" w:hAnsi="Times New Roman"/>
+                <w:b/>
+                <w:bCs/>
+                <w:color w:val="111111"/>
+                <w:sz w:val="18"/>
+                <w:szCs w:val="18"/>
+              </w:rPr>
+              <w:t xml:space="preserve">DGX · Isolation Forest (CPU)</w:t>
+            </w:r>
+          </w:p>
+        </w:tc>
+        <w:tc>
+          <w:tcPr>
+            <w:tcW w:type="dxa" w:w="1540"/>
+            <w:tcMar>
+              <w:top w:type="dxa" w:w="36"/>
+              <w:left w:type="dxa" w:w="70"/>
+              <w:bottom w:type="dxa" w:w="36"/>
+              <w:right w:type="dxa" w:w="70"/>
+            </w:tcMar>
+          </w:tcPr>
+          <w:p>
+            <w:pPr>
+              <w:jc w:val="center"/>
+            </w:pPr>
+            <w:r>
+              <w:rPr>
+                <w:rFonts w:ascii="Times New Roman" w:cs="Times New Roman" w:eastAsia="Times New Roman" w:hAnsi="Times New Roman"/>
+                <w:b w:val="false"/>
+                <w:bCs w:val="false"/>
+                <w:color w:val="111111"/>
+                <w:sz w:val="18"/>
+                <w:szCs w:val="18"/>
+              </w:rPr>
+              <w:t xml:space="preserve">585 (143)</w:t>
+            </w:r>
+          </w:p>
+        </w:tc>
+        <w:tc>
+          <w:tcPr>
+            <w:tcW w:type="dxa" w:w="1180"/>
+            <w:tcMar>
+              <w:top w:type="dxa" w:w="36"/>
+              <w:left w:type="dxa" w:w="70"/>
+              <w:bottom w:type="dxa" w:w="36"/>
+              <w:right w:type="dxa" w:w="70"/>
+            </w:tcMar>
+          </w:tcPr>
+          <w:p>
+            <w:pPr>
+              <w:jc w:val="center"/>
+            </w:pPr>
+            <w:r>
+              <w:rPr>
+                <w:rFonts w:ascii="Times New Roman" w:cs="Times New Roman" w:eastAsia="Times New Roman" w:hAnsi="Times New Roman"/>
+                <w:b w:val="false"/>
+                <w:bCs w:val="false"/>
+                <w:color w:val="111111"/>
+                <w:sz w:val="18"/>
+                <w:szCs w:val="18"/>
+              </w:rPr>
+              <w:t xml:space="preserve">0.989</w:t>
+            </w:r>
+          </w:p>
+        </w:tc>
+        <w:tc>
+          <w:tcPr>
+            <w:tcW w:type="dxa" w:w="1080"/>
+            <w:tcMar>
+              <w:top w:type="dxa" w:w="36"/>
+              <w:left w:type="dxa" w:w="70"/>
+              <w:bottom w:type="dxa" w:w="36"/>
+              <w:right w:type="dxa" w:w="70"/>
+            </w:tcMar>
+          </w:tcPr>
+          <w:p>
+            <w:pPr>
+              <w:jc w:val="center"/>
+            </w:pPr>
+            <w:r>
+              <w:rPr>
+                <w:rFonts w:ascii="Times New Roman" w:cs="Times New Roman" w:eastAsia="Times New Roman" w:hAnsi="Times New Roman"/>
+                <w:b w:val="false"/>
+                <w:bCs w:val="false"/>
+                <w:color w:val="111111"/>
+                <w:sz w:val="18"/>
+                <w:szCs w:val="18"/>
+              </w:rPr>
+              <w:t xml:space="preserve">1.000</w:t>
+            </w:r>
+          </w:p>
+        </w:tc>
+        <w:tc>
+          <w:tcPr>
+            <w:tcW w:type="dxa" w:w="1120"/>
+            <w:tcMar>
+              <w:top w:type="dxa" w:w="36"/>
+              <w:left w:type="dxa" w:w="70"/>
+              <w:bottom w:type="dxa" w:w="36"/>
+              <w:right w:type="dxa" w:w="70"/>
+            </w:tcMar>
+          </w:tcPr>
+          <w:p>
+            <w:pPr>
+              <w:jc w:val="center"/>
+            </w:pPr>
+            <w:r>
+              <w:rPr>
+                <w:rFonts w:ascii="Times New Roman" w:cs="Times New Roman" w:eastAsia="Times New Roman" w:hAnsi="Times New Roman"/>
+                <w:b w:val="false"/>
+                <w:bCs w:val="false"/>
+                <w:color w:val="111111"/>
+                <w:sz w:val="18"/>
+                <w:szCs w:val="18"/>
+              </w:rPr>
+              <w:t xml:space="preserve">0.975</w:t>
+            </w:r>
+          </w:p>
+        </w:tc>
+        <w:tc>
+          <w:tcPr>
+            <w:tcW w:type="dxa" w:w="1080"/>
+            <w:tcMar>
+              <w:top w:type="dxa" w:w="36"/>
+              <w:left w:type="dxa" w:w="70"/>
+              <w:bottom w:type="dxa" w:w="36"/>
+              <w:right w:type="dxa" w:w="70"/>
+            </w:tcMar>
+          </w:tcPr>
+          <w:p>
+            <w:pPr>
+              <w:jc w:val="center"/>
+            </w:pPr>
+            <w:r>
+              <w:rPr>
+                <w:rFonts w:ascii="Times New Roman" w:cs="Times New Roman" w:eastAsia="Times New Roman" w:hAnsi="Times New Roman"/>
+                <w:b w:val="false"/>
+                <w:bCs w:val="false"/>
+                <w:color w:val="111111"/>
+                <w:sz w:val="18"/>
+                <w:szCs w:val="18"/>
+              </w:rPr>
+              <w:t xml:space="preserve">0.987</w:t>
+            </w:r>
+          </w:p>
+        </w:tc>
+        <w:tc>
+          <w:tcPr>
+            <w:tcW w:type="dxa" w:w="1700"/>
+            <w:tcMar>
+              <w:top w:type="dxa" w:w="36"/>
+              <w:left w:type="dxa" w:w="70"/>
+              <w:bottom w:type="dxa" w:w="36"/>
+              <w:right w:type="dxa" w:w="70"/>
+            </w:tcMar>
+          </w:tcPr>
+          <w:p>
+            <w:pPr>
+              <w:jc w:val="center"/>
+            </w:pPr>
+            <w:r>
+              <w:rPr>
+                <w:rFonts w:ascii="Times New Roman" w:cs="Times New Roman" w:eastAsia="Times New Roman" w:hAnsi="Times New Roman"/>
+                <w:b w:val="false"/>
+                <w:bCs w:val="false"/>
+                <w:color w:val="111111"/>
+                <w:sz w:val="18"/>
+                <w:szCs w:val="18"/>
+              </w:rPr>
+              <w:t xml:space="preserve">9.4%</w:t>
+            </w:r>
+          </w:p>
+        </w:tc>
+      </w:tr>
+      <w:tr>
+        <w:tc>
+          <w:tcPr>
+            <w:tcW w:type="dxa" w:w="2380"/>
+            <w:tcMar>
+              <w:top w:type="dxa" w:w="36"/>
+              <w:left w:type="dxa" w:w="70"/>
+              <w:bottom w:type="dxa" w:w="36"/>
+              <w:right w:type="dxa" w:w="70"/>
+            </w:tcMar>
+          </w:tcPr>
+          <w:p>
+            <w:pPr>
+              <w:jc w:val="left"/>
+            </w:pPr>
+            <w:r>
+              <w:rPr>
+                <w:rFonts w:ascii="Times New Roman" w:cs="Times New Roman" w:eastAsia="Times New Roman" w:hAnsi="Times New Roman"/>
+                <w:b/>
+                <w:bCs/>
+                <w:color w:val="111111"/>
+                <w:sz w:val="18"/>
+                <w:szCs w:val="18"/>
+              </w:rPr>
+              <w:t xml:space="preserve">DGX · Autoencoder (GB10 GPU)</w:t>
+            </w:r>
+          </w:p>
+        </w:tc>
+        <w:tc>
+          <w:tcPr>
+            <w:tcW w:type="dxa" w:w="1540"/>
+            <w:tcMar>
+              <w:top w:type="dxa" w:w="36"/>
+              <w:left w:type="dxa" w:w="70"/>
+              <w:bottom w:type="dxa" w:w="36"/>
+              <w:right w:type="dxa" w:w="70"/>
+            </w:tcMar>
+          </w:tcPr>
+          <w:p>
+            <w:pPr>
+              <w:jc w:val="center"/>
+            </w:pPr>
+            <w:r>
+              <w:rPr>
+                <w:rFonts w:ascii="Times New Roman" w:cs="Times New Roman" w:eastAsia="Times New Roman" w:hAnsi="Times New Roman"/>
+                <w:b w:val="false"/>
+                <w:bCs w:val="false"/>
+                <w:color w:val="111111"/>
+                <w:sz w:val="18"/>
+                <w:szCs w:val="18"/>
+              </w:rPr>
+              <w:t xml:space="preserve">585 (143)</w:t>
+            </w:r>
+          </w:p>
+        </w:tc>
+        <w:tc>
+          <w:tcPr>
+            <w:tcW w:type="dxa" w:w="1180"/>
+            <w:tcMar>
+              <w:top w:type="dxa" w:w="36"/>
+              <w:left w:type="dxa" w:w="70"/>
+              <w:bottom w:type="dxa" w:w="36"/>
+              <w:right w:type="dxa" w:w="70"/>
+            </w:tcMar>
+          </w:tcPr>
+          <w:p>
+            <w:pPr>
+              <w:jc w:val="center"/>
+            </w:pPr>
+            <w:r>
+              <w:rPr>
+                <w:rFonts w:ascii="Times New Roman" w:cs="Times New Roman" w:eastAsia="Times New Roman" w:hAnsi="Times New Roman"/>
+                <w:b w:val="false"/>
+                <w:bCs w:val="false"/>
+                <w:color w:val="111111"/>
+                <w:sz w:val="18"/>
+                <w:szCs w:val="18"/>
+              </w:rPr>
+              <w:t xml:space="preserve">1.000</w:t>
+            </w:r>
+          </w:p>
+        </w:tc>
+        <w:tc>
+          <w:tcPr>
+            <w:tcW w:type="dxa" w:w="1080"/>
+            <w:tcMar>
+              <w:top w:type="dxa" w:w="36"/>
+              <w:left w:type="dxa" w:w="70"/>
+              <w:bottom w:type="dxa" w:w="36"/>
+              <w:right w:type="dxa" w:w="70"/>
+            </w:tcMar>
+          </w:tcPr>
+          <w:p>
+            <w:pPr>
+              <w:jc w:val="center"/>
+            </w:pPr>
+            <w:r>
+              <w:rPr>
+                <w:rFonts w:ascii="Times New Roman" w:cs="Times New Roman" w:eastAsia="Times New Roman" w:hAnsi="Times New Roman"/>
+                <w:b w:val="false"/>
+                <w:bCs w:val="false"/>
+                <w:color w:val="111111"/>
+                <w:sz w:val="18"/>
+                <w:szCs w:val="18"/>
+              </w:rPr>
+              <w:t xml:space="preserve">1.000</w:t>
+            </w:r>
+          </w:p>
+        </w:tc>
+        <w:tc>
+          <w:tcPr>
+            <w:tcW w:type="dxa" w:w="1120"/>
+            <w:tcMar>
+              <w:top w:type="dxa" w:w="36"/>
+              <w:left w:type="dxa" w:w="70"/>
+              <w:bottom w:type="dxa" w:w="36"/>
+              <w:right w:type="dxa" w:w="70"/>
+            </w:tcMar>
+          </w:tcPr>
+          <w:p>
+            <w:pPr>
+              <w:jc w:val="center"/>
+            </w:pPr>
+            <w:r>
+              <w:rPr>
+                <w:rFonts w:ascii="Times New Roman" w:cs="Times New Roman" w:eastAsia="Times New Roman" w:hAnsi="Times New Roman"/>
+                <w:b w:val="false"/>
+                <w:bCs w:val="false"/>
+                <w:color w:val="111111"/>
+                <w:sz w:val="18"/>
+                <w:szCs w:val="18"/>
+              </w:rPr>
+              <w:t xml:space="preserve">0.986</w:t>
+            </w:r>
+          </w:p>
+        </w:tc>
+        <w:tc>
+          <w:tcPr>
+            <w:tcW w:type="dxa" w:w="1080"/>
+            <w:tcMar>
+              <w:top w:type="dxa" w:w="36"/>
+              <w:left w:type="dxa" w:w="70"/>
+              <w:bottom w:type="dxa" w:w="36"/>
+              <w:right w:type="dxa" w:w="70"/>
+            </w:tcMar>
+          </w:tcPr>
+          <w:p>
+            <w:pPr>
+              <w:jc w:val="center"/>
+            </w:pPr>
+            <w:r>
+              <w:rPr>
+                <w:rFonts w:ascii="Times New Roman" w:cs="Times New Roman" w:eastAsia="Times New Roman" w:hAnsi="Times New Roman"/>
+                <w:b w:val="false"/>
+                <w:bCs w:val="false"/>
+                <w:color w:val="111111"/>
+                <w:sz w:val="18"/>
+                <w:szCs w:val="18"/>
+              </w:rPr>
+              <w:t xml:space="preserve">0.993</w:t>
+            </w:r>
+          </w:p>
+        </w:tc>
+        <w:tc>
+          <w:tcPr>
+            <w:tcW w:type="dxa" w:w="1700"/>
+            <w:tcMar>
+              <w:top w:type="dxa" w:w="36"/>
+              <w:left w:type="dxa" w:w="70"/>
+              <w:bottom w:type="dxa" w:w="36"/>
+              <w:right w:type="dxa" w:w="70"/>
+            </w:tcMar>
+          </w:tcPr>
+          <w:p>
+            <w:pPr>
+              <w:jc w:val="center"/>
+            </w:pPr>
+            <w:r>
+              <w:rPr>
+                <w:rFonts w:ascii="Times New Roman" w:cs="Times New Roman" w:eastAsia="Times New Roman" w:hAnsi="Times New Roman"/>
+                <w:b w:val="false"/>
+                <w:bCs w:val="false"/>
+                <w:color w:val="111111"/>
+                <w:sz w:val="18"/>
+                <w:szCs w:val="18"/>
+              </w:rPr>
+              <w:t xml:space="preserve">5.2%</w:t>
+            </w:r>
+          </w:p>
+        </w:tc>
+      </w:tr>
+    </w:tbl>
+    <w:p>
+      <w:pPr>
+        <w:spacing w:after="120"/>
+        <w:jc w:val="center"/>
+      </w:pPr>
+      <w:r>
+        <w:rPr>
+          <w:rFonts w:ascii="Times New Roman" w:cs="Times New Roman" w:eastAsia="Times New Roman" w:hAnsi="Times New Roman"/>
+          <w:i/>
+          <w:iCs/>
+          <w:color w:val="45526B"/>
+          <w:sz w:val="19"/>
+          <w:szCs w:val="19"/>
+        </w:rPr>
+        <w:t xml:space="preserve">Table 2. Detection results across three real-traffic runs (semi-supervised; trained on benign only).</w:t>
+      </w:r>
+    </w:p>
+    <w:p>
+      <w:pPr>
+        <w:spacing w:after="120" w:line="250"/>
+        <w:jc w:val="both"/>
+      </w:pPr>
+      <w:r>
+        <w:rPr>
+          <w:rFonts w:ascii="Times New Roman" w:cs="Times New Roman" w:eastAsia="Times New Roman" w:hAnsi="Times New Roman"/>
+          <w:color w:val="111111"/>
+          <w:sz w:val="24"/>
+          <w:szCs w:val="24"/>
+        </w:rPr>
+        <w:t xml:space="preserve">The pipeline also refuses to act on untrustworthy data: an early run with a deliberately thin benign baseline scored ROC-AUC 0.355 and was automatically rejected by the built-in quality guard — evidence that the loop fails safe rather than enforcing on a bad model. Together these results substantiate the two hardest stages of the loop, detection and enforcement, on real traffic.</w:t>
       </w:r>
     </w:p>
     <w:p>

</xml_diff>

<commit_message>
TechCon abstract: add reference [9] to the open-source testbed repo (author-neutral), cited in Evidence + Current status
</commit_message>
<xml_diff>
--- a/docs/hpe/techcon2027-self-securing-5g.docx
+++ b/docs/hpe/techcon2027-self-securing-5g.docx
@@ -1780,7 +1780,25 @@
           <w:sz w:val="24"/>
           <w:szCs w:val="24"/>
         </w:rPr>
-        <w:t xml:space="preserve">The pipeline also refuses to act on untrustworthy data: an early run with a deliberately thin benign baseline scored ROC-AUC 0.355 and was automatically rejected by the built-in quality guard — evidence that the loop fails safe rather than enforcing on a bad model. Together these results substantiate the two hardest stages of the loop, detection and enforcement, on real traffic.</w:t>
+        <w:t xml:space="preserve">The pipeline also refuses to act on untrustworthy data: an early run with a deliberately thin benign baseline scored ROC-AUC 0.355 and was automatically rejected by the built-in quality guard — evidence that the loop fails safe rather than enforcing on a bad model. Together these results substantiate the two hardest stages of the loop, detection and enforcement, on real traffic; the full testbed, attack corpus, and results are open-source </w:t>
+      </w:r>
+      <w:r>
+        <w:rPr>
+          <w:rFonts w:ascii="Times New Roman" w:cs="Times New Roman" w:eastAsia="Times New Roman" w:hAnsi="Times New Roman"/>
+          <w:color w:val="111111"/>
+          <w:sz w:val="24"/>
+          <w:szCs w:val="24"/>
+        </w:rPr>
+        <w:t xml:space="preserve">[9]</w:t>
+      </w:r>
+      <w:r>
+        <w:rPr>
+          <w:rFonts w:ascii="Times New Roman" w:cs="Times New Roman" w:eastAsia="Times New Roman" w:hAnsi="Times New Roman"/>
+          <w:color w:val="111111"/>
+          <w:sz w:val="24"/>
+          <w:szCs w:val="24"/>
+        </w:rPr>
+        <w:t xml:space="preserve">.</w:t>
       </w:r>
     </w:p>
     <w:p>
@@ -1862,7 +1880,25 @@
           <w:sz w:val="24"/>
           <w:szCs w:val="24"/>
         </w:rPr>
-        <w:t xml:space="preserve">The proof of concept runs today on GPU (DGX-class) hardware, with the detection and enforcement stages demonstrated and recorded. The agentic decision layer that closes the loop is in design on HPE’s agentic AIOps framework. By Tech Con we expect an integrated closed-loop demonstration with certified guardrails, and initial design-partner discussions with private-5G operators.</w:t>
+        <w:t xml:space="preserve">The proof of concept runs today on GPU (DGX-class) hardware, with the detection and enforcement stages demonstrated, recorded, and published in the open-source testbed </w:t>
+      </w:r>
+      <w:r>
+        <w:rPr>
+          <w:rFonts w:ascii="Times New Roman" w:cs="Times New Roman" w:eastAsia="Times New Roman" w:hAnsi="Times New Roman"/>
+          <w:color w:val="111111"/>
+          <w:sz w:val="24"/>
+          <w:szCs w:val="24"/>
+        </w:rPr>
+        <w:t xml:space="preserve">[9]</w:t>
+      </w:r>
+      <w:r>
+        <w:rPr>
+          <w:rFonts w:ascii="Times New Roman" w:cs="Times New Roman" w:eastAsia="Times New Roman" w:hAnsi="Times New Roman"/>
+          <w:color w:val="111111"/>
+          <w:sz w:val="24"/>
+          <w:szCs w:val="24"/>
+        </w:rPr>
+        <w:t xml:space="preserve">. The agentic decision layer that closes the loop is in design on HPE’s agentic AIOps framework. By Tech Con we expect an integrated closed-loop demonstration with certified guardrails, and initial design-partner discussions with private-5G operators.</w:t>
       </w:r>
     </w:p>
     <w:p>
@@ -2152,6 +2188,32 @@
           <w:szCs w:val="21"/>
         </w:rPr>
         <w:t xml:space="preserve">ETSI, “GS MEC 003: Multi-access Edge Computing (MEC); Framework and Reference Architecture,” ETSI. https://www.etsi.org/committee/mec</w:t>
+      </w:r>
+    </w:p>
+    <w:p>
+      <w:pPr>
+        <w:spacing w:after="70" w:line="238"/>
+        <w:ind w:left="360" w:hanging="360"/>
+      </w:pPr>
+      <w:r>
+        <w:rPr>
+          <w:rFonts w:ascii="Times New Roman" w:cs="Times New Roman" w:eastAsia="Times New Roman" w:hAnsi="Times New Roman"/>
+          <w:b/>
+          <w:bCs/>
+          <w:color w:val="111111"/>
+          <w:sz w:val="21"/>
+          <w:szCs w:val="21"/>
+        </w:rPr>
+        <w:t xml:space="preserve">[9]  </w:t>
+      </w:r>
+      <w:r>
+        <w:rPr>
+          <w:rFonts w:ascii="Times New Roman" w:cs="Times New Roman" w:eastAsia="Times New Roman" w:hAnsi="Times New Roman"/>
+          <w:color w:val="111111"/>
+          <w:sz w:val="21"/>
+          <w:szCs w:val="21"/>
+        </w:rPr>
+        <w:t xml:space="preserve">“5g-lab-in-a-box — an open-source 5G security testbed (Open5GS core, UERANSIM RAN, N3/N4 attack corpus, and ML anomaly detector),” GitHub. https://github.com/leungadh/5g-lab-in-a-box</w:t>
       </w:r>
     </w:p>
     <w:sectPr>

</xml_diff>